<commit_message>
Bigger press stroke, main arm lean at the press, base sweep and speed cap, fine search sketch
Point E: hover 38 mm, push 20 mm past contact (58 mm stroke), main arm
leans 3 deg extra at the bottom so its servos push too. Button now works
from 30 mm high to 32 mm low; receivers recheck clean, comments updated.
Start up: head up, slow base sweep to both ends and back to the middle.
Base capped at 18 deg/s (24 in gestures). More ultrasonic and colour
samples, longer settle in scans. New arm_controller_fine sketch with a
small hill climb search at A, B and C.

Co-Authored-By: Claude Opus 5.5 <noreply@anthropic.com>
Claude-Session: https://claude.ai/code/session_015nyq1RBSgqgf9GgU1FWB3V
</commit_message>
<xml_diff>
--- a/report/Group31_Robotic_Arm_Report.docx
+++ b/report/Group31_Robotic_Arm_Report.docx
@@ -1153,7 +1153,7 @@
           <w:b w:val="0"/>
           <w:i w:val="0"/>
         </w:rPr>
-        <w:t>For the button press the target is the pusher tip itself, with no standoff, so the arm can drive the tip along any line. Each press moves the tip straight down from 36 mm above the button to 12 mm into it. Pushing past contact means the servos keep pressing hard for the whole hold time.</w:t>
+        <w:t>For the button press the target is the pusher tip itself, with no standoff, so the arm can drive the tip along any line. Each press moves the tip straight down from 38 mm above the button to 20 mm into it, a 58 mm stroke. Pushing past contact means the servos keep pressing hard for the whole hold time. With two joints and a fixed button the joint angles at the press follow from the geometry, and a vertical press is mostly second arm motion. At the bottom of each press the main arm therefore leans a further 3 degrees, so the two main arm servos also push on the button.</w:t>
       </w:r>
     </w:p>
     <w:p>
@@ -2216,7 +2216,7 @@
           <w:b w:val="0"/>
           <w:i w:val="0"/>
         </w:rPr>
-        <w:t>Micro servos lose accuracy and heat up well before stall, so the shoulder relies on the tension spring. Without it, Point B and any pose with the main arm leaning far forward would sag or stall. The elbow servo runs at half its stall torque just holding the head, which leaves little in reserve for pressing: a typical 6 mm tactile switch needs 1.6 to 2.5 N, and the elbow alone can add about 1 N at the 184 mm pusher lever. The straight-line press therefore uses the shoulder and elbow together and drives 12 mm past contact so both servos push at close to full torque during the hold.</w:t>
+        <w:t>Micro servos lose accuracy and heat up well before stall, so the shoulder relies on the tension spring. Without it, Point B and any pose with the main arm leaning far forward would sag or stall. The elbow servo runs at half its stall torque just holding the head, which leaves little in reserve for pressing: a typical 6 mm tactile switch needs 1.6 to 2.5 N, and the elbow alone can add about 1 N at the 184 mm pusher lever. The straight-line press therefore uses the shoulder and elbow together, drives 20 mm past contact and leans the main arm 3 degrees extra at the bottom, so both joints push at close to full torque during the hold.</w:t>
       </w:r>
     </w:p>
     <w:p>
@@ -3219,7 +3219,7 @@
           <w:b w:val="0"/>
           <w:i w:val="0"/>
         </w:rPr>
-        <w:t>A hobby servo cannot report its position, so the first pulse after power-up sends it to the commanded angle at full speed. On this arm that jerk pulled cables loose and lifted the base gear out of its groove. The controller now sends each servo short bursts of pulses with pauses between them, so it creeps to the rest position: second arm first, then the main arm pair together, then the base, slowest of all. Two calibration sketches support the set-up. test_servos lets each joint be nudged to the true rest position (the two main arm servos can be trimmed separately so they do not fight) and prints the zero values to paste into the code. capture_points takes the arm to every station as the demonstration does, lets each one be nudged onto the real stand, tunes the press depth and height at E, and prints the corrected station lines.</w:t>
+        <w:t>A hobby servo cannot report its position, so the first pulse after power-up sends it to the commanded angle at full speed. On this arm that jerk pulled cables loose and lifted the base gear out of its groove. The controller now sends each servo short bursts of pulses with pauses between them, so it creeps to the rest position: second arm first, then the main arm pair together, then the base, slowest of all. The base then sweeps slowly to both ends and back to the middle with the head lifted, which beds the gear in and shows the swing is clear. Throughout the run the base is limited to 18 degrees per second, below the 30 degrees per second of the other joints. Two calibration sketches support the set-up. test_servos lets each joint be nudged to the true rest position (the two main arm servos can be trimmed separately so they do not fight) and prints the zero values to paste into the code. capture_points takes the arm to every station as the demonstration does, lets each one be nudged onto the real stand, tunes the press depth and height at E, and prints the corrected station lines.</w:t>
       </w:r>
     </w:p>
     <w:p>
@@ -3243,7 +3243,7 @@
           <w:b w:val="0"/>
           <w:i w:val="0"/>
         </w:rPr>
-        <w:t>The receiver splits dots from dashes at 1250 ms and ends a letter after 1200 ms of silence. A release shorter than 100 ms is treated as contact bounce within the same press. The press timing was checked in an offline model of the arm that runs the real sketch, tracks the pusher tip from the servo commands and records when the button would close. With the button from 30 mm higher to 12 mm lower than its nominal position, the button saw dots of 520 to 800 ms, dashes of 1720 to 2000 ms, gaps of 400 to 800 ms inside a letter and 1600 to 1880 ms between letters, so every band is at least 400 ms from a threshold. Both receiver sketches were then run against these recorded contact timelines: 1,536 runs covering eight words, eight button heights and contact chatter up to 90 ms, and 600 runs with every edge shifted randomly by up to 150 ms, all decoded correctly.</w:t>
+        <w:t>The receiver splits dots from dashes at 1250 ms and ends a letter after 1200 ms of silence. A release shorter than 100 ms is treated as contact bounce within the same press. The press timing was checked in an offline model of the arm that runs the real sketch, tracks the pusher tip from the servo commands and records when the button would close. With the button from 30 mm higher to 32 mm lower than its nominal position, the button saw dots of 520 to 800 ms, dashes of 1720 to 2000 ms, gaps of 400 to 680 ms inside a letter and 1600 to 1880 ms between letters, so every band is at least 400 ms from a threshold. Both receiver sketches were then run against these recorded contact timelines: 1,536 runs covering eight words, eight button heights and contact chatter up to 90 ms, and 720 runs with every edge shifted randomly by up to 150 ms, all decoded correctly.</w:t>
       </w:r>
     </w:p>
     <w:p>
@@ -3493,7 +3493,7 @@
           </w:tcPr>
           <w:p>
             <w:r>
-              <w:t>Soft start, base last and slowest; mechanical retention recommended</w:t>
+              <w:t>Soft start, base held to 18 deg/s, slow start-up sweep; mechanical retention recommended</w:t>
             </w:r>
           </w:p>
         </w:tc>
@@ -3525,7 +3525,7 @@
           </w:tcPr>
           <w:p>
             <w:r>
-              <w:t>Straight-line press with both joints, 12 mm past contact, 120 deg/s</w:t>
+              <w:t>Straight-line press with both joints, 20 mm past contact, 3 degree extra main arm lean, 120 deg/s</w:t>
             </w:r>
           </w:p>
         </w:tc>

</xml_diff>

<commit_message>
Bigger gestures, 70 mm press travel, base-only test sketch
Gestures are now set as joint angles so they are always full size: YES
nods the second arm 20 deg each way, NO and BOX swing the base 25 deg
each way, BOX rises 40 deg above B. The pusher waits 70 mm above the
button (second arm limit raised to +60), a 90 mm stroke. PRESS_CLOSE_AT
0.6 centres the timing: the button sees 600/1800/590/1790 ms at the
expected height and decodes from 50 mm high to 32 mm low. Receiver
thresholds unchanged, comments updated. New tests/test_base for fitting
the turntable at the servo's middle and setting SERVO_ZERO_BASE.

Co-Authored-By: Claude Opus 5.5 <noreply@anthropic.com>
Claude-Session: https://claude.ai/code/session_015nyq1RBSgqgf9GgU1FWB3V
</commit_message>
<xml_diff>
--- a/report/Group31_Robotic_Arm_Report.docx
+++ b/report/Group31_Robotic_Arm_Report.docx
@@ -1153,7 +1153,7 @@
           <w:b w:val="0"/>
           <w:i w:val="0"/>
         </w:rPr>
-        <w:t>For the button press the target is the pusher tip itself, with no standoff, so the arm can drive the tip along any line. Each press moves the tip straight down from 38 mm above the button to 20 mm into it, a 58 mm stroke. Pushing past contact means the servos keep pressing hard for the whole hold time. With two joints and a fixed button the joint angles at the press follow from the geometry, and a vertical press is mostly second arm motion. At the bottom of each press the main arm therefore leans a further 3 degrees, so the two main arm servos also push on the button.</w:t>
+        <w:t>For the button press the target is the pusher tip itself, with no standoff, so the arm can drive the tip along any line. Each press moves the tip straight down from 70 mm above the button to 20 mm into it, a 90 mm stroke. Pushing past contact means the servos keep pressing hard for the whole hold time. With two joints and a fixed button the joint angles at the press follow from the geometry, and a vertical press is mostly second arm motion. At the bottom of each press the main arm therefore leans a further 3 degrees, so the two main arm servos also push on the button.</w:t>
       </w:r>
     </w:p>
     <w:p>
@@ -3243,7 +3243,7 @@
           <w:b w:val="0"/>
           <w:i w:val="0"/>
         </w:rPr>
-        <w:t>The receiver splits dots from dashes at 1250 ms and ends a letter after 1200 ms of silence. A release shorter than 100 ms is treated as contact bounce within the same press. The press timing was checked in an offline model of the arm that runs the real sketch, tracks the pusher tip from the servo commands and records when the button would close. With the button from 30 mm higher to 32 mm lower than its nominal position, the button saw dots of 520 to 800 ms, dashes of 1720 to 2000 ms, gaps of 400 to 680 ms inside a letter and 1600 to 1880 ms between letters, so every band is at least 400 ms from a threshold. Both receiver sketches were then run against these recorded contact timelines: 1,536 runs covering eight words, eight button heights and contact chatter up to 90 ms, and 720 runs with every edge shifted randomly by up to 150 ms, all decoded correctly.</w:t>
+        <w:t>The receiver splits dots from dashes at 1250 ms and ends a letter after 1200 ms of silence. A release shorter than 100 ms is treated as contact bounce within the same press. The press timing was checked in an offline model of the arm that runs the real sketch, tracks the pusher tip from the servo commands and records when the button would close. With the button from 50 mm higher to 32 mm lower than its nominal position, the button saw dots of 400 to 800 ms, dashes of 1600 to 2000 ms, gaps of 390 to 790 ms inside a letter and 1590 to 1990 ms between letters, so every band is at least 350 ms from a threshold. Both receiver sketches were then run against these recorded contact timelines: 1,536 runs covering eight words, eight button heights and contact chatter up to 90 ms, and 840 runs with every edge shifted randomly by up to 150 ms, all decoded correctly.</w:t>
       </w:r>
     </w:p>
     <w:p>

</xml_diff>